<commit_message>
fix(forms): agrega saltos de linea en la plantilla para evitar solapamiento
Algunas clausulas quedaban con poco espacio si el texto llenado era
largo, con riesgo de que se solapara con la linea siguiente. Se le
agregan saltos de linea a esas clausulas para darle mas aire. Verificado
contra app/forms/filler.py::_FIELDS: ninguna coordenada de los campos
que se rellenan (blancos con subrayado, bloque de firma) se movio con
este cambio, asi que no hace falta recalcularlas.
</commit_message>
<xml_diff>
--- a/app/forms/templates/AUTORIZACIÓN DE CORRETAJE INMOBILIARIO ALBERTO ÁLVAREZ.docx
+++ b/app/forms/templates/AUTORIZACIÓN DE CORRETAJE INMOBILIARIO ALBERTO ÁLVAREZ.docx
@@ -42,7 +42,25 @@
           <w:szCs w:val="16"/>
           <w:lang w:val="es-ES"/>
         </w:rPr>
-        <w:t>____________</w:t>
+        <w:t>___________</w:t>
+      </w:r>
+      <w:r>
+        <w:rPr>
+          <w:rFonts w:ascii="Verdana" w:hAnsi="Verdana" w:cs="Tahoma"/>
+          <w:sz w:val="16"/>
+          <w:szCs w:val="16"/>
+          <w:lang w:val="es-ES"/>
+        </w:rPr>
+        <w:t>__</w:t>
+      </w:r>
+      <w:r>
+        <w:rPr>
+          <w:rFonts w:ascii="Verdana" w:hAnsi="Verdana" w:cs="Tahoma"/>
+          <w:sz w:val="16"/>
+          <w:szCs w:val="16"/>
+          <w:lang w:val="es-ES"/>
+        </w:rPr>
+        <w:t>_</w:t>
       </w:r>
       <w:r>
         <w:rPr>
@@ -128,7 +146,25 @@
           <w:szCs w:val="16"/>
           <w:lang w:val="es-ES"/>
         </w:rPr>
-        <w:t>________</w:t>
+        <w:t>_</w:t>
+      </w:r>
+      <w:r>
+        <w:rPr>
+          <w:rFonts w:ascii="Verdana" w:hAnsi="Verdana" w:cs="Tahoma"/>
+          <w:sz w:val="16"/>
+          <w:szCs w:val="16"/>
+          <w:lang w:val="es-ES"/>
+        </w:rPr>
+        <w:t>__</w:t>
+      </w:r>
+      <w:r>
+        <w:rPr>
+          <w:rFonts w:ascii="Verdana" w:hAnsi="Verdana" w:cs="Tahoma"/>
+          <w:sz w:val="16"/>
+          <w:szCs w:val="16"/>
+          <w:lang w:val="es-ES"/>
+        </w:rPr>
+        <w:t>_______</w:t>
       </w:r>
       <w:r>
         <w:rPr>
@@ -412,7 +448,23 @@
           <w:sz w:val="16"/>
           <w:szCs w:val="16"/>
         </w:rPr>
-        <w:t>____ Municipio: ______________</w:t>
+        <w:t>___</w:t>
+      </w:r>
+      <w:r>
+        <w:rPr>
+          <w:rFonts w:ascii="Verdana" w:hAnsi="Verdana"/>
+          <w:sz w:val="16"/>
+          <w:szCs w:val="16"/>
+        </w:rPr>
+        <w:t>____</w:t>
+      </w:r>
+      <w:r>
+        <w:rPr>
+          <w:rFonts w:ascii="Verdana" w:hAnsi="Verdana"/>
+          <w:sz w:val="16"/>
+          <w:szCs w:val="16"/>
+        </w:rPr>
+        <w:t xml:space="preserve">_ </w:t>
       </w:r>
     </w:p>
     <w:p>
@@ -430,6 +482,40 @@
           <w:sz w:val="16"/>
           <w:szCs w:val="16"/>
         </w:rPr>
+        <w:t>Municipio: ____________</w:t>
+      </w:r>
+      <w:r>
+        <w:rPr>
+          <w:rFonts w:ascii="Verdana" w:hAnsi="Verdana"/>
+          <w:sz w:val="16"/>
+          <w:szCs w:val="16"/>
+        </w:rPr>
+        <w:t>______</w:t>
+      </w:r>
+      <w:r>
+        <w:rPr>
+          <w:rFonts w:ascii="Verdana" w:hAnsi="Verdana"/>
+          <w:sz w:val="16"/>
+          <w:szCs w:val="16"/>
+        </w:rPr>
+        <w:t>__</w:t>
+      </w:r>
+    </w:p>
+    <w:p>
+      <w:pPr>
+        <w:pStyle w:val="Sinespaciado"/>
+        <w:rPr>
+          <w:rFonts w:ascii="Verdana" w:hAnsi="Verdana"/>
+          <w:sz w:val="16"/>
+          <w:szCs w:val="16"/>
+        </w:rPr>
+      </w:pPr>
+      <w:r>
+        <w:rPr>
+          <w:rFonts w:ascii="Verdana" w:hAnsi="Verdana"/>
+          <w:sz w:val="16"/>
+          <w:szCs w:val="16"/>
+        </w:rPr>
         <w:t>Matrícula inmobiliaria: ______________________</w:t>
       </w:r>
     </w:p>
@@ -508,12 +594,22 @@
         </w:rPr>
         <w:t xml:space="preserve"> </w:t>
       </w:r>
-      <w:r>
+    </w:p>
+    <w:p>
+      <w:pPr>
+        <w:pStyle w:val="Sinespaciado"/>
         <w:rPr>
           <w:rFonts w:ascii="Verdana" w:hAnsi="Verdana"/>
           <w:sz w:val="16"/>
           <w:szCs w:val="16"/>
         </w:rPr>
+      </w:pPr>
+      <w:r>
+        <w:rPr>
+          <w:rFonts w:ascii="Verdana" w:hAnsi="Verdana"/>
+          <w:sz w:val="16"/>
+          <w:szCs w:val="16"/>
+        </w:rPr>
         <w:t xml:space="preserve">Leasing: </w:t>
       </w:r>
       <w:r>
@@ -540,7 +636,7 @@
           <w:sz w:val="16"/>
           <w:szCs w:val="16"/>
         </w:rPr>
-        <w:t>Saldo actual de la deuda: $</w:t>
+        <w:t>Saldo actual de la deuda</w:t>
       </w:r>
       <w:r>
         <w:rPr>
@@ -548,7 +644,7 @@
           <w:sz w:val="16"/>
           <w:szCs w:val="16"/>
         </w:rPr>
-        <w:t xml:space="preserve">__________________ </w:t>
+        <w:t xml:space="preserve"> (aproximado)</w:t>
       </w:r>
       <w:r>
         <w:rPr>
@@ -556,7 +652,15 @@
           <w:sz w:val="16"/>
           <w:szCs w:val="16"/>
         </w:rPr>
-        <w:t>aproximadamente.</w:t>
+        <w:t>: $</w:t>
+      </w:r>
+      <w:r>
+        <w:rPr>
+          <w:rFonts w:ascii="Verdana" w:hAnsi="Verdana"/>
+          <w:sz w:val="16"/>
+          <w:szCs w:val="16"/>
+        </w:rPr>
+        <w:t>__________________</w:t>
       </w:r>
     </w:p>
     <w:p>
@@ -1355,6 +1459,7 @@
           <w:szCs w:val="16"/>
           <w:lang w:val="es-ES"/>
         </w:rPr>
+        <w:lastRenderedPageBreak/>
         <w:t>Seguir a cabalidad las instrucciones del interesado</w:t>
       </w:r>
       <w:r>
@@ -1425,7 +1530,6 @@
           <w:szCs w:val="16"/>
           <w:lang w:val="es-ES"/>
         </w:rPr>
-        <w:lastRenderedPageBreak/>
         <w:t>No usar el sistema MLS como medio para desarrollar actividades ilegales.</w:t>
       </w:r>
     </w:p>
@@ -2080,6 +2184,7 @@
       <w:r>
         <w:rPr>
           <w:rFonts w:ascii="Verdana" w:hAnsi="Verdana" w:cs="Tahoma"/>
+          <w:noProof/>
           <w:sz w:val="16"/>
           <w:szCs w:val="16"/>
           <w:lang w:val="es-ES"/>
@@ -2170,6 +2275,7 @@
       <w:r>
         <w:rPr>
           <w:rFonts w:ascii="Verdana" w:hAnsi="Verdana" w:cs="Tahoma"/>
+          <w:noProof/>
           <w:sz w:val="16"/>
           <w:szCs w:val="16"/>
           <w:lang w:val="es-ES"/>
@@ -2362,6 +2468,7 @@
       <w:r>
         <w:rPr>
           <w:rFonts w:ascii="Verdana" w:hAnsi="Verdana" w:cs="Tahoma"/>
+          <w:noProof/>
           <w:sz w:val="16"/>
           <w:szCs w:val="16"/>
           <w:lang w:val="es-ES"/>
@@ -2705,6 +2812,7 @@
         <w:rFonts w:ascii="Verdana" w:hAnsi="Verdana"/>
         <w:b/>
         <w:bCs/>
+        <w:noProof/>
       </w:rPr>
       <w:drawing>
         <wp:anchor distT="0" distB="0" distL="114300" distR="114300" simplePos="0" relativeHeight="251660288" behindDoc="0" locked="0" layoutInCell="1" allowOverlap="1" wp14:anchorId="61F75039" wp14:editId="33862E43">

</xml_diff>